<commit_message>
Aanvoerderspagina werkt met backend
</commit_message>
<xml_diff>
--- a/QUICK WINS voor Dennis.docx
+++ b/QUICK WINS voor Dennis.docx
@@ -25,35 +25,7 @@
         <w:rPr>
           <w:lang w:val="nl-NL"/>
         </w:rPr>
-        <w:t xml:space="preserve">3 </w:t>
-      </w:r>
-      <w:proofErr w:type="spellStart"/>
-      <w:r>
-        <w:rPr>
-          <w:lang w:val="nl-NL"/>
-        </w:rPr>
-        <w:t>divs</w:t>
-      </w:r>
-      <w:proofErr w:type="spellEnd"/>
-      <w:r>
-        <w:rPr>
-          <w:lang w:val="nl-NL"/>
-        </w:rPr>
-        <w:t xml:space="preserve"> met plaatjes hebben een contrast van </w:t>
-      </w:r>
-      <w:proofErr w:type="gramStart"/>
-      <w:r>
-        <w:rPr>
-          <w:lang w:val="nl-NL"/>
-        </w:rPr>
-        <w:t>2.94 :</w:t>
-      </w:r>
-      <w:proofErr w:type="gramEnd"/>
-      <w:r>
-        <w:rPr>
-          <w:lang w:val="nl-NL"/>
-        </w:rPr>
-        <w:t xml:space="preserve"> 1 en dat zorgt voor contrastproblemen.</w:t>
+        <w:t>3 divs met plaatjes hebben een contrast van 2.94 : 1 en dat zorgt voor contrastproblemen.</w:t>
       </w:r>
     </w:p>
     <w:p>
@@ -82,39 +54,17 @@
           <w:lang w:val="nl-NL"/>
         </w:rPr>
       </w:pPr>
-      <w:proofErr w:type="gramStart"/>
-      <w:r>
-        <w:rPr>
-          <w:lang w:val="nl-NL"/>
-        </w:rPr>
-        <w:t>elk</w:t>
-      </w:r>
-      <w:proofErr w:type="gramEnd"/>
-      <w:r>
-        <w:rPr>
-          <w:lang w:val="nl-NL"/>
-        </w:rPr>
-        <w:t xml:space="preserve"> plaatje op de website h</w:t>
-      </w:r>
-      <w:r>
-        <w:rPr>
-          <w:lang w:val="nl-NL"/>
-        </w:rPr>
-        <w:t xml:space="preserve">eeft beschrijvende alt-tekst, behalve de slideshow aan de bovenkant van de pagina, het logo aan de onderkant van de pagina en de </w:t>
-      </w:r>
-      <w:proofErr w:type="spellStart"/>
-      <w:r>
-        <w:rPr>
-          <w:lang w:val="nl-NL"/>
-        </w:rPr>
-        <w:t>social</w:t>
-      </w:r>
-      <w:proofErr w:type="spellEnd"/>
-      <w:r>
-        <w:rPr>
-          <w:lang w:val="nl-NL"/>
-        </w:rPr>
-        <w:t xml:space="preserve"> media links aan de onderkant van de pagina</w:t>
+      <w:r>
+        <w:rPr>
+          <w:lang w:val="nl-NL"/>
+        </w:rPr>
+        <w:t>elk plaatje op de website h</w:t>
+      </w:r>
+      <w:r>
+        <w:rPr>
+          <w:lang w:val="nl-NL"/>
+        </w:rPr>
+        <w:t>eeft beschrijvende alt-tekst, behalve de slideshow aan de bovenkant van de pagina, het logo aan de onderkant van de pagina en de social media links aan de onderkant van de pagina</w:t>
       </w:r>
     </w:p>
     <w:p>
@@ -164,25 +114,94 @@
       </w:r>
     </w:p>
     <w:p>
-      <w:r>
-        <w:rPr>
-          <w:lang w:val="nl-NL"/>
-        </w:rPr>
-        <w:t xml:space="preserve">Er zijn bij het kopje “Toegankelijkheid” meerdere kopjes die zich voordoen als paragrafen. Er is wel maar 1 h1 per pagina en 1 h2 bij de </w:t>
-      </w:r>
-      <w:proofErr w:type="spellStart"/>
-      <w:r>
-        <w:rPr>
-          <w:lang w:val="nl-NL"/>
-        </w:rPr>
-        <w:t>footer</w:t>
-      </w:r>
-      <w:proofErr w:type="spellEnd"/>
-      <w:r>
-        <w:rPr>
-          <w:lang w:val="nl-NL"/>
-        </w:rPr>
-        <w:t>. Wel is er nog een h3 onder het kopje “Bereikbaarheid”.</w:t>
+      <w:pPr>
+        <w:rPr>
+          <w:lang w:val="nl-NL"/>
+        </w:rPr>
+      </w:pPr>
+      <w:r>
+        <w:rPr>
+          <w:lang w:val="nl-NL"/>
+        </w:rPr>
+        <w:t>Er zijn bij het kopje “Toegankelijkheid” meerdere kopjes die zich voordoen als paragrafen. Er is wel maar 1 h1 per pagina en 1 h2 bij de footer. Wel is er nog een h3 onder het kopje “Bereikbaarheid”.</w:t>
+      </w:r>
+    </w:p>
+    <w:p>
+      <w:pPr>
+        <w:rPr>
+          <w:lang w:val="nl-NL"/>
+        </w:rPr>
+      </w:pPr>
+    </w:p>
+    <w:p>
+      <w:pPr>
+        <w:rPr>
+          <w:lang w:val="nl-NL"/>
+        </w:rPr>
+      </w:pPr>
+      <w:r>
+        <w:rPr>
+          <w:lang w:val="nl-NL"/>
+        </w:rPr>
+        <w:t>QUICK WIN 5</w:t>
+      </w:r>
+    </w:p>
+    <w:p>
+      <w:pPr>
+        <w:rPr>
+          <w:lang w:val="nl-NL"/>
+        </w:rPr>
+      </w:pPr>
+      <w:r>
+        <w:rPr>
+          <w:lang w:val="nl-NL"/>
+        </w:rPr>
+        <w:t>De enige video bevat geen zelfgemaakte ondertiteling, maar wel gegenereerde ondertiteling.</w:t>
+      </w:r>
+    </w:p>
+    <w:p>
+      <w:pPr>
+        <w:rPr>
+          <w:lang w:val="nl-NL"/>
+        </w:rPr>
+      </w:pPr>
+    </w:p>
+    <w:p>
+      <w:r>
+        <w:t>QUICK WIN 6</w:t>
+      </w:r>
+    </w:p>
+    <w:p>
+      <w:r>
+        <w:t>De paginas Bezoekersinfo en Contact bevatten de juiste paginatitel.</w:t>
+      </w:r>
+      <w:r>
+        <w:br/>
+        <w:t>De winkelwagen pagina bevat de verkeerde titel.</w:t>
+      </w:r>
+      <w:r>
+        <w:br/>
+        <w:t>De tickets pagina bevat geen title.</w:t>
+      </w:r>
+      <w:r>
+        <w:br/>
+        <w:t>Een van de artiestenpagina bevat wel een title, maar niet beschrijvend.</w:t>
+      </w:r>
+    </w:p>
+    <w:p/>
+    <w:p>
+      <w:r>
+        <w:t>QUICK WIN 7</w:t>
+      </w:r>
+      <w:r>
+        <w:br/>
+      </w:r>
+      <w:r>
+        <w:t>Als ik naar iets zoek kan ik niet uit de zoekbalk/resultaten komen.</w:t>
+      </w:r>
+      <w:r>
+        <w:br/>
+        <w:t>Bij bezoekersinfo kan ik niet op het tabje toegankelijkheid komen(ironsich)</w:t>
       </w:r>
     </w:p>
     <w:sectPr>

</xml_diff>